<commit_message>
docs: rewrite README, add MIT license, tidy repository metadata
</commit_message>
<xml_diff>
--- a/documentation/M0-Foundations.docx
+++ b/documentation/M0-Foundations.docx
@@ -4639,7 +4639,7 @@
         <w:br/>
         <w:t>+-- Makefile                 one entry point for every operation</w:t>
         <w:br/>
-        <w:t>+-- CLAUDE.md                conventions, GPU gotchas, the documentation rule</w:t>
+        <w:t>+-- docs/CONVENTIONS.md                conventions, GPU gotchas, the documentation rule</w:t>
         <w:br/>
         <w:t>+-- scripts/</w:t>
         <w:br/>
@@ -10367,7 +10367,7 @@
                 <w:color w:val="1F4E57"/>
                 <w:sz w:val="18"/>
               </w:rPr>
-              <w:t>CLAUDE.md</w:t>
+              <w:t>docs/CONVENTIONS.md</w:t>
             </w:r>
             <w:r>
               <w:rPr>
@@ -13397,7 +13397,7 @@
                 <w:color w:val="1F4E57"/>
                 <w:sz w:val="17"/>
               </w:rPr>
-              <w:t>CLAUDE.md</w:t>
+              <w:t>docs/CONVENTIONS.md</w:t>
             </w:r>
             <w:r>
               <w:rPr>
@@ -13836,7 +13836,59 @@
                 <w:color w:val="1A1F2B"/>
                 <w:sz w:val="19"/>
               </w:rPr>
-              <w:t xml:space="preserve"> deleted the scratchpad in </w:t>
+              <w:t xml:space="preserve"> deleted a scratch working directory kept under it.</w:t>
+            </w:r>
+          </w:p>
+        </w:tc>
+        <w:tc>
+          <w:tcPr>
+            <w:tcW w:type="dxa" w:w="1944"/>
+          </w:tcPr>
+          <w:p>
+            <w:pPr>
+              <w:spacing w:before="40" w:after="40"/>
+            </w:pPr>
+            <w:r/>
+            <w:r>
+              <w:rPr>
+                <w:rFonts w:ascii="Calibri" w:hAnsi="Calibri"/>
+                <w:b/>
+                <w:i w:val="0"/>
+                <w:color w:val="1A1F2B"/>
+                <w:sz w:val="19"/>
+              </w:rPr>
+              <w:t>Nothing</w:t>
+            </w:r>
+            <w:r>
+              <w:rPr>
+                <w:rFonts w:ascii="Calibri" w:hAnsi="Calibri"/>
+                <w:b w:val="0"/>
+                <w:i w:val="0"/>
+                <w:color w:val="1A1F2B"/>
+                <w:sz w:val="19"/>
+              </w:rPr>
+              <w:t xml:space="preserve"> - everything had already been committed</w:t>
+            </w:r>
+          </w:p>
+        </w:tc>
+        <w:tc>
+          <w:tcPr>
+            <w:tcW w:type="dxa" w:w="3888"/>
+          </w:tcPr>
+          <w:p>
+            <w:pPr>
+              <w:spacing w:before="40" w:after="40"/>
+            </w:pPr>
+            <w:r/>
+            <w:r>
+              <w:rPr>
+                <w:rFonts w:ascii="Calibri" w:hAnsi="Calibri"/>
+                <w:b w:val="0"/>
+                <w:i w:val="0"/>
+                <w:color w:val="1A1F2B"/>
+                <w:sz w:val="19"/>
+              </w:rPr>
+              <w:t xml:space="preserve">Recorded in </w:t>
             </w:r>
             <w:r>
               <w:rPr>
@@ -13846,79 +13898,7 @@
                 <w:color w:val="1F4E57"/>
                 <w:sz w:val="17"/>
               </w:rPr>
-              <w:t>Temp\claude\</w:t>
-            </w:r>
-            <w:r>
-              <w:rPr>
-                <w:rFonts w:ascii="Calibri" w:hAnsi="Calibri"/>
-                <w:b w:val="0"/>
-                <w:i w:val="0"/>
-                <w:color w:val="1A1F2B"/>
-                <w:sz w:val="19"/>
-              </w:rPr>
-              <w:t>.</w:t>
-            </w:r>
-          </w:p>
-        </w:tc>
-        <w:tc>
-          <w:tcPr>
-            <w:tcW w:type="dxa" w:w="1944"/>
-          </w:tcPr>
-          <w:p>
-            <w:pPr>
-              <w:spacing w:before="40" w:after="40"/>
-            </w:pPr>
-            <w:r/>
-            <w:r>
-              <w:rPr>
-                <w:rFonts w:ascii="Calibri" w:hAnsi="Calibri"/>
-                <w:b/>
-                <w:i w:val="0"/>
-                <w:color w:val="1A1F2B"/>
-                <w:sz w:val="19"/>
-              </w:rPr>
-              <w:t>Nothing</w:t>
-            </w:r>
-            <w:r>
-              <w:rPr>
-                <w:rFonts w:ascii="Calibri" w:hAnsi="Calibri"/>
-                <w:b w:val="0"/>
-                <w:i w:val="0"/>
-                <w:color w:val="1A1F2B"/>
-                <w:sz w:val="19"/>
-              </w:rPr>
-              <w:t xml:space="preserve"> - everything had already been committed</w:t>
-            </w:r>
-          </w:p>
-        </w:tc>
-        <w:tc>
-          <w:tcPr>
-            <w:tcW w:type="dxa" w:w="3888"/>
-          </w:tcPr>
-          <w:p>
-            <w:pPr>
-              <w:spacing w:before="40" w:after="40"/>
-            </w:pPr>
-            <w:r/>
-            <w:r>
-              <w:rPr>
-                <w:rFonts w:ascii="Calibri" w:hAnsi="Calibri"/>
-                <w:b w:val="0"/>
-                <w:i w:val="0"/>
-                <w:color w:val="1A1F2B"/>
-                <w:sz w:val="19"/>
-              </w:rPr>
-              <w:t xml:space="preserve">Recorded in </w:t>
-            </w:r>
-            <w:r>
-              <w:rPr>
-                <w:rFonts w:ascii="Consolas" w:hAnsi="Consolas"/>
-                <w:b w:val="0"/>
-                <w:i w:val="0"/>
-                <w:color w:val="1F4E57"/>
-                <w:sz w:val="17"/>
-              </w:rPr>
-              <w:t>CLAUDE.md</w:t>
+              <w:t>docs/CONVENTIONS.md</w:t>
             </w:r>
             <w:r>
               <w:rPr>
@@ -15811,7 +15791,7 @@
                 <w:color w:val="1F4E57"/>
                 <w:sz w:val="17"/>
               </w:rPr>
-              <w:t>CLAUDE.md</w:t>
+              <w:t>docs/CONVENTIONS.md</w:t>
             </w:r>
             <w:r>
               <w:rPr>

</xml_diff>

<commit_message>
docs: reframe as a personal learning project
- add docs/devlog.md (dated notes, first person)
- rewrite docs/CONVENTIONS.md in my own voice; drop the no-schedule rule
- drop the check-time make target
- README: add a 'why I'm building this' section
- documentation/: milestone write-ups framed as my build notes
</commit_message>
<xml_diff>
--- a/documentation/M0-Foundations.docx
+++ b/documentation/M0-Foundations.docx
@@ -13709,7 +13709,7 @@
                 <w:color w:val="1A1F2B"/>
                 <w:sz w:val="19"/>
               </w:rPr>
-              <w:t>Overwrote a file edited in the wrong place.</w:t>
+              <w:t>Edited the wrong copy of a file.</w:t>
             </w:r>
             <w:r>
               <w:rPr>
@@ -13719,7 +13719,7 @@
                 <w:color w:val="1A1F2B"/>
                 <w:sz w:val="19"/>
               </w:rPr>
-              <w:t xml:space="preserve"> The README's GPU section was edited directly in the repository, then silently reverted by the next sync from the staging directory.</w:t>
+              <w:t xml:space="preserve"> I changed the README's GPU section in one working copy while a different checkout was the one being committed, so the edit looked like it had vanished.</w:t>
             </w:r>
           </w:p>
         </w:tc>
@@ -13741,7 +13741,7 @@
                 <w:color w:val="1A1F2B"/>
                 <w:sz w:val="19"/>
               </w:rPr>
-              <w:t>Lost edit, caught by a follow-up check</w:t>
+              <w:t>A confusing hour; edit recovered</w:t>
             </w:r>
           </w:p>
         </w:tc>
@@ -13763,7 +13763,7 @@
                 <w:color w:val="1A1F2B"/>
                 <w:sz w:val="19"/>
               </w:rPr>
-              <w:t xml:space="preserve">One source of truth. Edits go to staging and sync forward, never the reverse - and the result is verified with </w:t>
+              <w:t xml:space="preserve">Keep one working copy as the source of truth, and </w:t>
             </w:r>
             <w:r>
               <w:rPr>
@@ -13783,7 +13783,7 @@
                 <w:color w:val="1A1F2B"/>
                 <w:sz w:val="19"/>
               </w:rPr>
-              <w:t xml:space="preserve"> afterwards rather than assumed.</w:t>
+              <w:t xml:space="preserve"> the committed file afterwards to confirm the change actually landed.</w:t>
             </w:r>
           </w:p>
         </w:tc>
@@ -13806,7 +13806,7 @@
                 <w:color w:val="1A1F2B"/>
                 <w:sz w:val="19"/>
               </w:rPr>
-              <w:t>Cleared a temporary folder that contained my own working directory.</w:t>
+              <w:t>Cleared a temp folder that had a working checkout under it.</w:t>
             </w:r>
             <w:r>
               <w:rPr>
@@ -13816,7 +13816,7 @@
                 <w:color w:val="1A1F2B"/>
                 <w:sz w:val="19"/>
               </w:rPr>
-              <w:t xml:space="preserve"> Reclaiming C: by emptying </w:t>
+              <w:t xml:space="preserve"> Freeing space on C: by emptying </w:t>
             </w:r>
             <w:r>
               <w:rPr>
@@ -13836,7 +13836,7 @@
                 <w:color w:val="1A1F2B"/>
                 <w:sz w:val="19"/>
               </w:rPr>
-              <w:t xml:space="preserve"> deleted a scratch working directory kept under it.</w:t>
+              <w:t xml:space="preserve"> took a scratch checkout with it.</w:t>
             </w:r>
           </w:p>
         </w:tc>
@@ -13867,7 +13867,7 @@
                 <w:color w:val="1A1F2B"/>
                 <w:sz w:val="19"/>
               </w:rPr>
-              <w:t xml:space="preserve"> - everything had already been committed</w:t>
+              <w:t xml:space="preserve"> - everything was committed and pushed</w:t>
             </w:r>
           </w:p>
         </w:tc>
@@ -13888,7 +13888,7 @@
                 <w:color w:val="1A1F2B"/>
                 <w:sz w:val="19"/>
               </w:rPr>
-              <w:t xml:space="preserve">Recorded in </w:t>
+              <w:t xml:space="preserve">It only cost nothing because I commit at each checkpoint. Working directories don't live under </w:t>
             </w:r>
             <w:r>
               <w:rPr>
@@ -13898,7 +13898,7 @@
                 <w:color w:val="1F4E57"/>
                 <w:sz w:val="17"/>
               </w:rPr>
-              <w:t>docs/CONVENTIONS.md</w:t>
+              <w:t>Temp</w:t>
             </w:r>
             <w:r>
               <w:rPr>
@@ -13908,7 +13908,7 @@
                 <w:color w:val="1A1F2B"/>
                 <w:sz w:val="19"/>
               </w:rPr>
-              <w:t>. The reason it cost nothing is the discipline of committing at each checkpoint; the same mistake an hour earlier would have been expensive.</w:t>
+              <w:t xml:space="preserve"> any more.</w:t>
             </w:r>
           </w:p>
         </w:tc>
@@ -13942,7 +13942,7 @@
                 <w:color w:val="1A1F2B"/>
                 <w:sz w:val="19"/>
               </w:rPr>
-              <w:t xml:space="preserve"> The Docker disk move was reported as done and was not.</w:t>
+              <w:t xml:space="preserve"> Docker reported the disk-location move as done; it hadn't happened.</w:t>
             </w:r>
           </w:p>
         </w:tc>
@@ -13986,7 +13986,7 @@
                 <w:color w:val="1A1F2B"/>
                 <w:sz w:val="19"/>
               </w:rPr>
-              <w:t>Verify state, not the report: check which file the OS has open, and check the registry, rather than believing a dialog.</w:t>
+              <w:t>Check the state, not the dialog: which file the OS actually has open, and the registry.</w:t>
             </w:r>
           </w:p>
         </w:tc>
@@ -14052,7 +14052,7 @@
                 <w:color w:val="1A1F2B"/>
                 <w:sz w:val="20"/>
               </w:rPr>
-              <w:t>believing a report instead of checking the state.</w:t>
+              <w:t>trusting a report instead of checking the state.</w:t>
             </w:r>
             <w:r>
               <w:rPr>
@@ -14062,7 +14062,7 @@
                 <w:color w:val="1A1F2B"/>
                 <w:sz w:val="20"/>
               </w:rPr>
-              <w:t xml:space="preserve"> A version string that was never verified, a sync assumed to be one-directional, a folder assumed to be disposable, a migration assumed to have run. The habit worth building is cheap and specific - after any operation that claims success, ask what observable fact would be true if it really had.</w:t>
+              <w:t xml:space="preserve"> A version string I never verified, the wrong file open, a folder I assumed was disposable, a migration I assumed had run. The habit worth building is cheap and specific - after anything that claims success, ask what observable fact would be true if it really had.</w:t>
             </w:r>
           </w:p>
         </w:tc>

</xml_diff>